<commit_message>
Add Platform Options Advisory for Datastore Capacity and Fill Projection
This advisory outlines the recommendation for VCF Operations to manage datastore fill projections and alerting, rather than transitioning the existing PowerShell script to Orchestrator. It details the capabilities of VCF Operations, the advantages of using its native features, and the implications for reporting and alerting. The document also includes validation steps before retiring the existing script and clarifies the impact on the current deliverable.
</commit_message>
<xml_diff>
--- a/Ansible to Orchestrator Transition/InProgress/Get Datastores Greater than 75 Percent Used/Documentation/01_Executive_Summary.docx
+++ b/Ansible to Orchestrator Transition/InProgress/Get Datastores Greater than 75 Percent Used/Documentation/01_Executive_Summary.docx
@@ -10,7 +10,7 @@
           <w:sz w:val="22"/>
           <w:szCs w:val="24"/>
         </w:rPr>
-        <w:id w:val="619113242"/>
+        <w:id w:val="84117956"/>
         <w:docPartObj>
           <w:docPartGallery w:val="Table of Contents"/>
           <w:docPartUnique/>
@@ -51,7 +51,7 @@
           <w:r>
             <w:fldChar w:fldCharType="separate"/>
           </w:r>
-          <w:hyperlink w:anchor="_Toc237256651" w:history="1">
+          <w:hyperlink w:anchor="_Toc237519827" w:history="1">
             <w:r>
               <w:rPr>
                 <w:rStyle w:val="Hyperlink"/>
@@ -78,7 +78,7 @@
                 <w:noProof/>
                 <w:webHidden/>
               </w:rPr>
-              <w:instrText xml:space="preserve"> PAGEREF _Toc237256651 \h </w:instrText>
+              <w:instrText xml:space="preserve"> PAGEREF _Toc237519827 \h </w:instrText>
             </w:r>
             <w:r>
               <w:rPr>
@@ -125,7 +125,7 @@
               <w14:ligatures w14:val="standardContextual"/>
             </w:rPr>
           </w:pPr>
-          <w:hyperlink w:anchor="_Toc237256652" w:history="1">
+          <w:hyperlink w:anchor="_Toc237519828" w:history="1">
             <w:r>
               <w:rPr>
                 <w:rStyle w:val="Hyperlink"/>
@@ -152,7 +152,7 @@
                 <w:noProof/>
                 <w:webHidden/>
               </w:rPr>
-              <w:instrText xml:space="preserve"> PAGEREF _Toc237256652 \h </w:instrText>
+              <w:instrText xml:space="preserve"> PAGEREF _Toc237519828 \h </w:instrText>
             </w:r>
             <w:r>
               <w:rPr>
@@ -199,7 +199,7 @@
               <w14:ligatures w14:val="standardContextual"/>
             </w:rPr>
           </w:pPr>
-          <w:hyperlink w:anchor="_Toc237256653" w:history="1">
+          <w:hyperlink w:anchor="_Toc237519829" w:history="1">
             <w:r>
               <w:rPr>
                 <w:rStyle w:val="Hyperlink"/>
@@ -226,7 +226,7 @@
                 <w:noProof/>
                 <w:webHidden/>
               </w:rPr>
-              <w:instrText xml:space="preserve"> PAGEREF _Toc237256653 \h </w:instrText>
+              <w:instrText xml:space="preserve"> PAGEREF _Toc237519829 \h </w:instrText>
             </w:r>
             <w:r>
               <w:rPr>
@@ -273,7 +273,7 @@
               <w14:ligatures w14:val="standardContextual"/>
             </w:rPr>
           </w:pPr>
-          <w:hyperlink w:anchor="_Toc237256654" w:history="1">
+          <w:hyperlink w:anchor="_Toc237519830" w:history="1">
             <w:r>
               <w:rPr>
                 <w:rStyle w:val="Hyperlink"/>
@@ -300,7 +300,7 @@
                 <w:noProof/>
                 <w:webHidden/>
               </w:rPr>
-              <w:instrText xml:space="preserve"> PAGEREF _Toc237256654 \h </w:instrText>
+              <w:instrText xml:space="preserve"> PAGEREF _Toc237519830 \h </w:instrText>
             </w:r>
             <w:r>
               <w:rPr>
@@ -347,7 +347,7 @@
               <w14:ligatures w14:val="standardContextual"/>
             </w:rPr>
           </w:pPr>
-          <w:hyperlink w:anchor="_Toc237256655" w:history="1">
+          <w:hyperlink w:anchor="_Toc237519831" w:history="1">
             <w:r>
               <w:rPr>
                 <w:rStyle w:val="Hyperlink"/>
@@ -374,7 +374,7 @@
                 <w:noProof/>
                 <w:webHidden/>
               </w:rPr>
-              <w:instrText xml:space="preserve"> PAGEREF _Toc237256655 \h </w:instrText>
+              <w:instrText xml:space="preserve"> PAGEREF _Toc237519831 \h </w:instrText>
             </w:r>
             <w:r>
               <w:rPr>
@@ -421,7 +421,7 @@
               <w14:ligatures w14:val="standardContextual"/>
             </w:rPr>
           </w:pPr>
-          <w:hyperlink w:anchor="_Toc237256656" w:history="1">
+          <w:hyperlink w:anchor="_Toc237519832" w:history="1">
             <w:r>
               <w:rPr>
                 <w:rStyle w:val="Hyperlink"/>
@@ -448,7 +448,7 @@
                 <w:noProof/>
                 <w:webHidden/>
               </w:rPr>
-              <w:instrText xml:space="preserve"> PAGEREF _Toc237256656 \h </w:instrText>
+              <w:instrText xml:space="preserve"> PAGEREF _Toc237519832 \h </w:instrText>
             </w:r>
             <w:r>
               <w:rPr>
@@ -495,7 +495,7 @@
               <w14:ligatures w14:val="standardContextual"/>
             </w:rPr>
           </w:pPr>
-          <w:hyperlink w:anchor="_Toc237256657" w:history="1">
+          <w:hyperlink w:anchor="_Toc237519833" w:history="1">
             <w:r>
               <w:rPr>
                 <w:rStyle w:val="Hyperlink"/>
@@ -522,7 +522,7 @@
                 <w:noProof/>
                 <w:webHidden/>
               </w:rPr>
-              <w:instrText xml:space="preserve"> PAGEREF _Toc237256657 \h </w:instrText>
+              <w:instrText xml:space="preserve"> PAGEREF _Toc237519833 \h </w:instrText>
             </w:r>
             <w:r>
               <w:rPr>
@@ -569,7 +569,7 @@
               <w14:ligatures w14:val="standardContextual"/>
             </w:rPr>
           </w:pPr>
-          <w:hyperlink w:anchor="_Toc237256658" w:history="1">
+          <w:hyperlink w:anchor="_Toc237519834" w:history="1">
             <w:r>
               <w:rPr>
                 <w:rStyle w:val="Hyperlink"/>
@@ -596,7 +596,7 @@
                 <w:noProof/>
                 <w:webHidden/>
               </w:rPr>
-              <w:instrText xml:space="preserve"> PAGEREF _Toc237256658 \h </w:instrText>
+              <w:instrText xml:space="preserve"> PAGEREF _Toc237519834 \h </w:instrText>
             </w:r>
             <w:r>
               <w:rPr>
@@ -639,7 +639,7 @@
         <w:pStyle w:val="Heading1"/>
       </w:pPr>
       <w:bookmarkStart w:id="0" w:name="X89efa367303de086a3fec6ba4b59702033930ad"/>
-      <w:bookmarkStart w:id="1" w:name="_Toc237256651"/>
+      <w:bookmarkStart w:id="1" w:name="_Toc237519827"/>
       <w:r>
         <w:t>Executive Summary — Datastore Capacity Reporting</w:t>
       </w:r>
@@ -692,7 +692,7 @@
     </w:p>
     <w:p>
       <w:r>
-        <w:pict w14:anchorId="72688293">
+        <w:pict w14:anchorId="2D0D8001">
           <v:rect id="_x0000_i1025" style="width:0;height:1.5pt" o:hralign="center" o:hrstd="t" o:hr="t"/>
         </w:pict>
       </w:r>
@@ -702,7 +702,7 @@
         <w:pStyle w:val="Heading2"/>
       </w:pPr>
       <w:bookmarkStart w:id="2" w:name="objective"/>
-      <w:bookmarkStart w:id="3" w:name="_Toc237256652"/>
+      <w:bookmarkStart w:id="3" w:name="_Toc237519828"/>
       <w:r>
         <w:t>Objective</w:t>
       </w:r>
@@ -729,7 +729,7 @@
     </w:p>
     <w:p>
       <w:r>
-        <w:pict w14:anchorId="2E662E6D">
+        <w:pict w14:anchorId="79F4636D">
           <v:rect id="_x0000_i1026" style="width:0;height:1.5pt" o:hralign="center" o:hrstd="t" o:hr="t"/>
         </w:pict>
       </w:r>
@@ -739,7 +739,7 @@
         <w:pStyle w:val="Heading2"/>
       </w:pPr>
       <w:bookmarkStart w:id="4" w:name="scope"/>
-      <w:bookmarkStart w:id="5" w:name="_Toc237256653"/>
+      <w:bookmarkStart w:id="5" w:name="_Toc237519829"/>
       <w:bookmarkEnd w:id="2"/>
       <w:r>
         <w:t>Scope</w:t>
@@ -891,7 +891,7 @@
     </w:p>
     <w:p>
       <w:r>
-        <w:pict w14:anchorId="210FCA2A">
+        <w:pict w14:anchorId="2F974E3A">
           <v:rect id="_x0000_i1027" style="width:0;height:1.5pt" o:hralign="center" o:hrstd="t" o:hr="t"/>
         </w:pict>
       </w:r>
@@ -901,7 +901,7 @@
         <w:pStyle w:val="Heading2"/>
       </w:pPr>
       <w:bookmarkStart w:id="6" w:name="high-level-approach"/>
-      <w:bookmarkStart w:id="7" w:name="_Toc237256654"/>
+      <w:bookmarkStart w:id="7" w:name="_Toc237519830"/>
       <w:bookmarkEnd w:id="4"/>
       <w:r>
         <w:t>High-level approach</w:t>
@@ -965,7 +965,7 @@
     </w:p>
     <w:p>
       <w:r>
-        <w:pict w14:anchorId="75CB7A6E">
+        <w:pict w14:anchorId="5AA0C3D6">
           <v:rect id="_x0000_i1028" style="width:0;height:1.5pt" o:hralign="center" o:hrstd="t" o:hr="t"/>
         </w:pict>
       </w:r>
@@ -975,7 +975,7 @@
         <w:pStyle w:val="Heading2"/>
       </w:pPr>
       <w:bookmarkStart w:id="8" w:name="key-benefits"/>
-      <w:bookmarkStart w:id="9" w:name="_Toc237256655"/>
+      <w:bookmarkStart w:id="9" w:name="_Toc237519831"/>
       <w:bookmarkEnd w:id="6"/>
       <w:r>
         <w:t>Key benefits</w:t>
@@ -1197,7 +1197,7 @@
     </w:tbl>
     <w:p>
       <w:r>
-        <w:pict w14:anchorId="1A24D19D">
+        <w:pict w14:anchorId="6485CE7E">
           <v:rect id="_x0000_i1029" style="width:0;height:1.5pt" o:hralign="center" o:hrstd="t" o:hr="t"/>
         </w:pict>
       </w:r>
@@ -1207,7 +1207,7 @@
         <w:pStyle w:val="Heading2"/>
       </w:pPr>
       <w:bookmarkStart w:id="10" w:name="key-risks"/>
-      <w:bookmarkStart w:id="11" w:name="_Toc237256656"/>
+      <w:bookmarkStart w:id="11" w:name="_Toc237519832"/>
       <w:bookmarkEnd w:id="8"/>
       <w:r>
         <w:t>Key risks</w:t>
@@ -1222,8 +1222,8 @@
       </w:tblPr>
       <w:tblGrid>
         <w:gridCol w:w="328"/>
-        <w:gridCol w:w="5165"/>
-        <w:gridCol w:w="4083"/>
+        <w:gridCol w:w="4935"/>
+        <w:gridCol w:w="4313"/>
       </w:tblGrid>
       <w:tr>
         <w:trPr>
@@ -1539,10 +1539,149 @@
           </w:p>
         </w:tc>
       </w:tr>
+      <w:tr>
+        <w:tc>
+          <w:tcPr>
+            <w:tcW w:w="0" w:type="auto"/>
+          </w:tcPr>
+          <w:p>
+            <w:pPr>
+              <w:pStyle w:val="Compact"/>
+            </w:pPr>
+            <w:r>
+              <w:t>6</w:t>
+            </w:r>
+          </w:p>
+        </w:tc>
+        <w:tc>
+          <w:tcPr>
+            <w:tcW w:w="0" w:type="auto"/>
+          </w:tcPr>
+          <w:p>
+            <w:pPr>
+              <w:pStyle w:val="Compact"/>
+            </w:pPr>
+            <w:r>
+              <w:rPr>
+                <w:b/>
+                <w:bCs/>
+              </w:rPr>
+              <w:t>Which script generation is deployed is unconfirmed.</w:t>
+            </w:r>
+            <w:r>
+              <w:t xml:space="preserve"> </w:t>
+            </w:r>
+            <w:r>
+              <w:rPr>
+                <w:rStyle w:val="VerbatimChar"/>
+              </w:rPr>
+              <w:t>cvs_50_100.ps1</w:t>
+            </w:r>
+            <w:r>
+              <w:t xml:space="preserve"> is newer than the </w:t>
+            </w:r>
+            <w:r>
+              <w:rPr>
+                <w:rStyle w:val="VerbatimChar"/>
+              </w:rPr>
+              <w:t>cvs_functions.ps1</w:t>
+            </w:r>
+            <w:r>
+              <w:t xml:space="preserve"> case, but not confirmed as the version on the production schedule.</w:t>
+            </w:r>
+          </w:p>
+        </w:tc>
+        <w:tc>
+          <w:tcPr>
+            <w:tcW w:w="0" w:type="auto"/>
+          </w:tcPr>
+          <w:p>
+            <w:pPr>
+              <w:pStyle w:val="Compact"/>
+            </w:pPr>
+            <w:r>
+              <w:t>Does not change what the transition delivers, but it does change the parallel-run baseline. Confirm before comparison — Change Register open item 9.</w:t>
+            </w:r>
+          </w:p>
+        </w:tc>
+      </w:tr>
+      <w:tr>
+        <w:tc>
+          <w:tcPr>
+            <w:tcW w:w="0" w:type="auto"/>
+          </w:tcPr>
+          <w:p>
+            <w:pPr>
+              <w:pStyle w:val="Compact"/>
+            </w:pPr>
+            <w:r>
+              <w:t>7</w:t>
+            </w:r>
+          </w:p>
+        </w:tc>
+        <w:tc>
+          <w:tcPr>
+            <w:tcW w:w="0" w:type="auto"/>
+          </w:tcPr>
+          <w:p>
+            <w:pPr>
+              <w:pStyle w:val="Compact"/>
+            </w:pPr>
+            <w:r>
+              <w:rPr>
+                <w:b/>
+                <w:bCs/>
+              </w:rPr>
+              <w:t>A third, newer report exists</w:t>
+            </w:r>
+            <w:r>
+              <w:t xml:space="preserve"> — </w:t>
+            </w:r>
+            <w:r>
+              <w:rPr>
+                <w:rStyle w:val="VerbatimChar"/>
+              </w:rPr>
+              <w:t>datastore_fill_projection_report.yml</w:t>
+            </w:r>
+            <w:r>
+              <w:t xml:space="preserve"> — adding historical growth projection. It may be the intended successor to this report rather than a peer.</w:t>
+            </w:r>
+          </w:p>
+        </w:tc>
+        <w:tc>
+          <w:tcPr>
+            <w:tcW w:w="0" w:type="auto"/>
+          </w:tcPr>
+          <w:p>
+            <w:pPr>
+              <w:pStyle w:val="Compact"/>
+            </w:pPr>
+            <w:r>
+              <w:rPr>
+                <w:b/>
+                <w:bCs/>
+              </w:rPr>
+              <w:t>Recommendation: do not transition it to Orchestrator.</w:t>
+            </w:r>
+            <w:r>
+              <w:t xml:space="preserve"> VCF Operations does fill projection natively and better. See </w:t>
+            </w:r>
+            <w:r>
+              <w:rPr>
+                <w:rStyle w:val="VerbatimChar"/>
+              </w:rPr>
+              <w:t>06_Platform_Options_Advisory.md</w:t>
+            </w:r>
+            <w:r>
+              <w:t>. Decision required.</w:t>
+            </w:r>
+          </w:p>
+        </w:tc>
+      </w:tr>
     </w:tbl>
     <w:p>
       <w:r>
-        <w:pict w14:anchorId="118A2D0F">
+        <w:pict w14:anchorId="7C4FAB3C">
           <v:rect id="_x0000_i1030" style="width:0;height:1.5pt" o:hralign="center" o:hrstd="t" o:hr="t"/>
         </w:pict>
       </w:r>
@@ -1552,7 +1691,7 @@
         <w:pStyle w:val="Heading2"/>
       </w:pPr>
       <w:bookmarkStart w:id="12" w:name="Xa68bc3cfa573072f3dfb7ce624c083d39ae4d10"/>
-      <w:bookmarkStart w:id="13" w:name="_Toc237256657"/>
+      <w:bookmarkStart w:id="13" w:name="_Toc237519833"/>
       <w:bookmarkEnd w:id="10"/>
       <w:r>
         <w:t>Defects found in the customer's existing automation</w:t>
@@ -1564,7 +1703,26 @@
         <w:pStyle w:val="FirstParagraph"/>
       </w:pPr>
       <w:r>
-        <w:t>Six, all silent, all affecting the report as it runs today independently of this transition. Four of them mean the report being received is not the report the recipients believe they are receiving.</w:t>
+        <w:t xml:space="preserve">Two generations of the script exist. </w:t>
+      </w:r>
+      <w:r>
+        <w:rPr>
+          <w:rStyle w:val="VerbatimChar"/>
+        </w:rPr>
+        <w:t>cvs_50_100.ps1</w:t>
+      </w:r>
+      <w:r>
+        <w:t xml:space="preserve"> is the newer standalone rewrite and </w:t>
+      </w:r>
+      <w:r>
+        <w:rPr>
+          <w:b/>
+          <w:bCs/>
+        </w:rPr>
+        <w:t>has already fixed some of what follows</w:t>
+      </w:r>
+      <w:r>
+        <w:t xml:space="preserve"> — it is better engineering than its predecessor and this deliverable credits it as such. The table shows what remains live in the newer script.</w:t>
       </w:r>
     </w:p>
     <w:tbl>
@@ -1574,8 +1732,8 @@
         <w:tblLook w:val="0020" w:firstRow="1" w:lastRow="0" w:firstColumn="0" w:lastColumn="0" w:noHBand="0" w:noVBand="0"/>
       </w:tblPr>
       <w:tblGrid>
-        <w:gridCol w:w="4310"/>
-        <w:gridCol w:w="5266"/>
+        <w:gridCol w:w="4559"/>
+        <w:gridCol w:w="5017"/>
       </w:tblGrid>
       <w:tr>
         <w:trPr>
@@ -1651,48 +1809,37 @@
               <w:pStyle w:val="Compact"/>
             </w:pPr>
             <w:r>
-              <w:t xml:space="preserve">No </w:t>
-            </w:r>
-            <w:r>
               <w:rPr>
                 <w:rStyle w:val="VerbatimChar"/>
               </w:rPr>
-              <w:t>try</w:t>
-            </w:r>
-            <w:r>
-              <w:t>/</w:t>
-            </w:r>
-            <w:r>
-              <w:rPr>
-                <w:rStyle w:val="VerbatimChar"/>
-              </w:rPr>
-              <w:t>catch</w:t>
-            </w:r>
-            <w:r>
-              <w:t xml:space="preserve"> around </w:t>
-            </w:r>
-            <w:r>
-              <w:rPr>
-                <w:rStyle w:val="VerbatimChar"/>
-              </w:rPr>
-              <w:t>Connect-VIServer</w:t>
-            </w:r>
-          </w:p>
-        </w:tc>
-        <w:tc>
-          <w:tcPr>
-            <w:tcW w:w="0" w:type="auto"/>
-          </w:tcPr>
-          <w:p>
-            <w:pPr>
-              <w:pStyle w:val="Compact"/>
-            </w:pPr>
+              <w:t>Sort-Object -Property Datastore -Unique</w:t>
+            </w:r>
+            <w:r>
+              <w:t xml:space="preserve"> de-duplicates on </w:t>
+            </w:r>
             <w:r>
               <w:rPr>
                 <w:b/>
                 <w:bCs/>
               </w:rPr>
-              <w:t>One unreachable vCenter out of five ends the run and emails nothing at all</w:t>
+              <w:t>name</w:t>
+            </w:r>
+          </w:p>
+        </w:tc>
+        <w:tc>
+          <w:tcPr>
+            <w:tcW w:w="0" w:type="auto"/>
+          </w:tcPr>
+          <w:p>
+            <w:pPr>
+              <w:pStyle w:val="Compact"/>
+            </w:pPr>
+            <w:r>
+              <w:rPr>
+                <w:b/>
+                <w:bCs/>
+              </w:rPr>
+              <w:t>Identically named datastores on different vCenters are silently discarded</w:t>
             </w:r>
           </w:p>
         </w:tc>
@@ -1707,7 +1854,7 @@
               <w:pStyle w:val="Compact"/>
             </w:pPr>
             <w:r>
-              <w:t>No divide-by-zero guard on datastore capacity</w:t>
+              <w:t>Band comparisons leave gaps</w:t>
             </w:r>
           </w:p>
         </w:tc>
@@ -1724,7 +1871,7 @@
                 <w:b/>
                 <w:bCs/>
               </w:rPr>
-              <w:t>One decommissioned datastore anywhere in the estate ends the run the same way</w:t>
+              <w:t>A datastore at exactly 90.00%, 89.99%, 80.00% or 70.00% is shown nowhere</w:t>
             </w:r>
           </w:p>
         </w:tc>
@@ -1739,20 +1886,45 @@
               <w:pStyle w:val="Compact"/>
             </w:pPr>
             <w:r>
-              <w:rPr>
-                <w:rStyle w:val="VerbatimChar"/>
-              </w:rPr>
-              <w:t>Sort-Object -Property Datastore -Unique</w:t>
-            </w:r>
-            <w:r>
-              <w:t xml:space="preserve"> de-duplicates on </w:t>
+              <w:t>Mail subject counts the top band only</w:t>
+            </w:r>
+          </w:p>
+        </w:tc>
+        <w:tc>
+          <w:tcPr>
+            <w:tcW w:w="0" w:type="auto"/>
+          </w:tcPr>
+          <w:p>
+            <w:pPr>
+              <w:pStyle w:val="Compact"/>
+            </w:pPr>
+            <w:r>
+              <w:t xml:space="preserve">A subject reading </w:t>
             </w:r>
             <w:r>
               <w:rPr>
                 <w:b/>
                 <w:bCs/>
               </w:rPr>
-              <w:t>name</w:t>
+              <w:t>"0 Datastores @ 90%"</w:t>
+            </w:r>
+            <w:r>
+              <w:t xml:space="preserve"> while fifty sit at 89%</w:t>
+            </w:r>
+          </w:p>
+        </w:tc>
+      </w:tr>
+      <w:tr>
+        <w:tc>
+          <w:tcPr>
+            <w:tcW w:w="0" w:type="auto"/>
+          </w:tcPr>
+          <w:p>
+            <w:pPr>
+              <w:pStyle w:val="Compact"/>
+            </w:pPr>
+            <w:r>
+              <w:t>A TCP/443 preflight covers unreachable vCenters, but not authentication</w:t>
             </w:r>
           </w:p>
         </w:tc>
@@ -1769,7 +1941,7 @@
                 <w:b/>
                 <w:bCs/>
               </w:rPr>
-              <w:t>Identically named datastores on different vCenters are silently discarded</w:t>
+              <w:t>A vCenter whose service account has expired or locked still ends the run and emails nothing</w:t>
             </w:r>
           </w:p>
         </w:tc>
@@ -1784,62 +1956,101 @@
               <w:pStyle w:val="Compact"/>
             </w:pPr>
             <w:r>
-              <w:t>Band comparisons leave gaps</w:t>
-            </w:r>
-          </w:p>
-        </w:tc>
-        <w:tc>
-          <w:tcPr>
-            <w:tcW w:w="0" w:type="auto"/>
-          </w:tcPr>
-          <w:p>
-            <w:pPr>
-              <w:pStyle w:val="Compact"/>
-            </w:pPr>
+              <w:t>No isolation around a single datastore's properties</w:t>
+            </w:r>
+          </w:p>
+        </w:tc>
+        <w:tc>
+          <w:tcPr>
+            <w:tcW w:w="0" w:type="auto"/>
+          </w:tcPr>
+          <w:p>
+            <w:pPr>
+              <w:pStyle w:val="Compact"/>
+            </w:pPr>
+            <w:r>
+              <w:t>One volume that faults mid-enumeration still ends the sweep</w:t>
+            </w:r>
+          </w:p>
+        </w:tc>
+      </w:tr>
+      <w:tr>
+        <w:tc>
+          <w:tcPr>
+            <w:tcW w:w="0" w:type="auto"/>
+          </w:tcPr>
+          <w:p>
+            <w:pPr>
+              <w:pStyle w:val="Compact"/>
+            </w:pPr>
+            <w:r>
+              <w:rPr>
+                <w:rStyle w:val="VerbatimChar"/>
+              </w:rPr>
+              <w:t>result.html</w:t>
+            </w:r>
+            <w:r>
+              <w:t xml:space="preserve"> written with </w:t>
+            </w:r>
+            <w:r>
+              <w:rPr>
+                <w:rStyle w:val="VerbatimChar"/>
+              </w:rPr>
+              <w:t>-Append</w:t>
+            </w:r>
+          </w:p>
+        </w:tc>
+        <w:tc>
+          <w:tcPr>
+            <w:tcW w:w="0" w:type="auto"/>
+          </w:tcPr>
+          <w:p>
+            <w:pPr>
+              <w:pStyle w:val="Compact"/>
+            </w:pPr>
+            <w:r>
+              <w:t>Grows without bound across scheduled runs</w:t>
+            </w:r>
+          </w:p>
+        </w:tc>
+      </w:tr>
+      <w:tr>
+        <w:tc>
+          <w:tcPr>
+            <w:tcW w:w="0" w:type="auto"/>
+          </w:tcPr>
+          <w:p>
+            <w:pPr>
+              <w:pStyle w:val="Compact"/>
+            </w:pPr>
+            <w:r>
+              <w:rPr>
+                <w:rStyle w:val="VerbatimChar"/>
+              </w:rPr>
+              <w:t>-InvalidCertificateAction Ignore</w:t>
+            </w:r>
+          </w:p>
+        </w:tc>
+        <w:tc>
+          <w:tcPr>
+            <w:tcW w:w="0" w:type="auto"/>
+          </w:tcPr>
+          <w:p>
+            <w:pPr>
+              <w:pStyle w:val="Compact"/>
+            </w:pPr>
+            <w:r>
+              <w:t xml:space="preserve">vCenter certificate validation is </w:t>
+            </w:r>
             <w:r>
               <w:rPr>
                 <w:b/>
                 <w:bCs/>
               </w:rPr>
-              <w:t>A datastore at exactly 90.00%, 89.99%, 80.00% or 70.00% is shown nowhere</w:t>
-            </w:r>
-          </w:p>
-        </w:tc>
-      </w:tr>
-      <w:tr>
-        <w:tc>
-          <w:tcPr>
-            <w:tcW w:w="0" w:type="auto"/>
-          </w:tcPr>
-          <w:p>
-            <w:pPr>
-              <w:pStyle w:val="Compact"/>
-            </w:pPr>
-            <w:r>
-              <w:t>Mail subject counts the top band only</w:t>
-            </w:r>
-          </w:p>
-        </w:tc>
-        <w:tc>
-          <w:tcPr>
-            <w:tcW w:w="0" w:type="auto"/>
-          </w:tcPr>
-          <w:p>
-            <w:pPr>
-              <w:pStyle w:val="Compact"/>
-            </w:pPr>
-            <w:r>
-              <w:t xml:space="preserve">A subject reading </w:t>
-            </w:r>
-            <w:r>
-              <w:rPr>
-                <w:b/>
-                <w:bCs/>
-              </w:rPr>
-              <w:t>"0 Datastores @ 90%"</w:t>
-            </w:r>
-            <w:r>
-              <w:t xml:space="preserve"> while fifty sit at 89%</w:t>
+              <w:t>disabled</w:t>
+            </w:r>
+            <w:r>
+              <w:t xml:space="preserve"> on the connection carrying the service-account credential</w:t>
             </w:r>
           </w:p>
         </w:tc>
@@ -1849,23 +2060,48 @@
       <w:pPr>
         <w:pStyle w:val="BodyText"/>
       </w:pPr>
-      <w:r>
-        <w:t xml:space="preserve">Full detail, including why each is silent, is in </w:t>
-      </w:r>
       <w:r>
         <w:rPr>
           <w:b/>
           <w:bCs/>
         </w:rPr>
-        <w:t>Change-Register.md §1A</w:t>
+        <w:t>Already fixed in the newer script, and therefore not claimed as defects:</w:t>
+      </w:r>
+      <w:r>
+        <w:t xml:space="preserve"> the divide-by-zero on zero-capacity datastores, and the unstyled report — the newer script has a well-built, Outlook-safe HTML formatter, which this deliverable </w:t>
+      </w:r>
+      <w:r>
+        <w:rPr>
+          <w:b/>
+          <w:bCs/>
+        </w:rPr>
+        <w:t>adopted rather than replaced</w:t>
       </w:r>
       <w:r>
         <w:t>.</w:t>
       </w:r>
     </w:p>
     <w:p>
-      <w:r>
-        <w:pict w14:anchorId="7CEF54B0">
+      <w:pPr>
+        <w:pStyle w:val="BodyText"/>
+      </w:pPr>
+      <w:r>
+        <w:t xml:space="preserve">Full detail and the generation-by-generation matrix are in </w:t>
+      </w:r>
+      <w:r>
+        <w:rPr>
+          <w:b/>
+          <w:bCs/>
+        </w:rPr>
+        <w:t>Change-Register.md §1A and §1D</w:t>
+      </w:r>
+      <w:r>
+        <w:t>.</w:t>
+      </w:r>
+    </w:p>
+    <w:p>
+      <w:r>
+        <w:pict w14:anchorId="1769197B">
           <v:rect id="_x0000_i1031" style="width:0;height:1.5pt" o:hralign="center" o:hrstd="t" o:hr="t"/>
         </w:pict>
       </w:r>
@@ -1875,7 +2111,7 @@
         <w:pStyle w:val="Heading2"/>
       </w:pPr>
       <w:bookmarkStart w:id="14" w:name="status-and-next-steps"/>
-      <w:bookmarkStart w:id="15" w:name="_Toc237256658"/>
+      <w:bookmarkStart w:id="15" w:name="_Toc237519834"/>
       <w:bookmarkEnd w:id="12"/>
       <w:r>
         <w:t>Status and next steps</w:t>
@@ -2153,7 +2389,7 @@
   <w:abstractNum w:abstractNumId="0" w15:restartNumberingAfterBreak="0">
     <w:nsid w:val="0000A990"/>
     <w:multiLevelType w:val="multilevel"/>
-    <w:tmpl w:val="B4E0689E"/>
+    <w:tmpl w:val="C19C20E8"/>
     <w:lvl w:ilvl="0">
       <w:numFmt w:val="bullet"/>
       <w:lvlText w:val=" "/>
@@ -2230,7 +2466,7 @@
   <w:abstractNum w:abstractNumId="1" w15:restartNumberingAfterBreak="0">
     <w:nsid w:val="0000A991"/>
     <w:multiLevelType w:val="multilevel"/>
-    <w:tmpl w:val="1A22CFB8"/>
+    <w:tmpl w:val="3EE067FA"/>
     <w:lvl w:ilvl="0">
       <w:numFmt w:val="bullet"/>
       <w:lvlText w:val=""/>
@@ -2331,13 +2567,13 @@
       </w:rPr>
     </w:lvl>
   </w:abstractNum>
-  <w:num w:numId="1" w16cid:durableId="1941133597">
+  <w:num w:numId="1" w16cid:durableId="1121849879">
     <w:abstractNumId w:val="0"/>
   </w:num>
-  <w:num w:numId="2" w16cid:durableId="1255674538">
+  <w:num w:numId="2" w16cid:durableId="392776400">
     <w:abstractNumId w:val="1"/>
   </w:num>
-  <w:num w:numId="3" w16cid:durableId="1897617517">
+  <w:num w:numId="3" w16cid:durableId="1811172258">
     <w:abstractNumId w:val="1"/>
   </w:num>
 </w:numbering>
@@ -3601,7 +3837,7 @@
     <w:next w:val="Normal"/>
     <w:autoRedefine/>
     <w:uiPriority w:val="39"/>
-    <w:rsid w:val="0062537B"/>
+    <w:rsid w:val="00161D7F"/>
     <w:pPr>
       <w:spacing w:after="100"/>
     </w:pPr>
@@ -3612,7 +3848,7 @@
     <w:next w:val="Normal"/>
     <w:autoRedefine/>
     <w:uiPriority w:val="39"/>
-    <w:rsid w:val="0062537B"/>
+    <w:rsid w:val="00161D7F"/>
     <w:pPr>
       <w:spacing w:after="100"/>
       <w:ind w:left="220"/>

</xml_diff>